<commit_message>
remove red winged blackbird
</commit_message>
<xml_diff>
--- a/output/results.docx
+++ b/output/results.docx
@@ -283,7 +283,7 @@
               <w:pStyle w:val="Compact"/>
             </w:pPr>
             <w:r>
-              <w:t xml:space="preserve">(6, 9.9)</w:t>
+              <w:t xml:space="preserve">(6.1, 9.8)</w:t>
             </w:r>
           </w:p>
         </w:tc>
@@ -315,7 +315,7 @@
               <w:pStyle w:val="Compact"/>
             </w:pPr>
             <w:r>
-              <w:t xml:space="preserve">8.4</w:t>
+              <w:t xml:space="preserve">8.9</w:t>
             </w:r>
           </w:p>
         </w:tc>
@@ -347,18 +347,18 @@
               <w:pStyle w:val="Compact"/>
             </w:pPr>
             <w:r>
-              <w:t xml:space="preserve">5e-09</w:t>
-            </w:r>
-          </w:p>
-        </w:tc>
-        <w:tc>
-          <w:tcPr/>
-          <w:p>
-            <w:pPr>
-              <w:pStyle w:val="Compact"/>
-            </w:pPr>
-            <w:r>
-              <w:t xml:space="preserve">2e-17</w:t>
+              <w:t xml:space="preserve">2e-09</w:t>
+            </w:r>
+          </w:p>
+        </w:tc>
+        <w:tc>
+          <w:tcPr/>
+          <w:p>
+            <w:pPr>
+              <w:pStyle w:val="Compact"/>
+            </w:pPr>
+            <w:r>
+              <w:t xml:space="preserve">1e-17</w:t>
             </w:r>
           </w:p>
         </w:tc>
@@ -382,7 +382,7 @@
               <w:pStyle w:val="Compact"/>
             </w:pPr>
             <w:r>
-              <w:t xml:space="preserve">2.2</w:t>
+              <w:t xml:space="preserve">2.1</w:t>
             </w:r>
           </w:p>
         </w:tc>
@@ -414,18 +414,18 @@
               <w:pStyle w:val="Compact"/>
             </w:pPr>
             <w:r>
-              <w:t xml:space="preserve">(-0.3, 4.8)</w:t>
-            </w:r>
-          </w:p>
-        </w:tc>
-        <w:tc>
-          <w:tcPr/>
-          <w:p>
-            <w:pPr>
-              <w:pStyle w:val="Compact"/>
-            </w:pPr>
-            <w:r>
-              <w:t xml:space="preserve">(-0.1, 0.45)</w:t>
+              <w:t xml:space="preserve">(-0.26, 4.5)</w:t>
+            </w:r>
+          </w:p>
+        </w:tc>
+        <w:tc>
+          <w:tcPr/>
+          <w:p>
+            <w:pPr>
+              <w:pStyle w:val="Compact"/>
+            </w:pPr>
+            <w:r>
+              <w:t xml:space="preserve">(-0.1, 0.43)</w:t>
             </w:r>
           </w:p>
         </w:tc>
@@ -524,82 +524,93 @@
               <w:pStyle w:val="Compact"/>
             </w:pPr>
             <w:r>
-              <w:t xml:space="preserve">0.43</w:t>
-            </w:r>
-          </w:p>
-        </w:tc>
-      </w:tr>
-      <w:tr>
-        <w:tc>
-          <w:tcPr/>
-          <w:p>
-            <w:pPr>
-              <w:pStyle w:val="Compact"/>
-            </w:pPr>
-          </w:p>
-        </w:tc>
-        <w:tc>
-          <w:tcPr/>
-          <w:p>
-            <w:pPr>
-              <w:pStyle w:val="Compact"/>
-            </w:pPr>
-            <w:r>
-              <w:t xml:space="preserve">(3.1, 5.9)</w:t>
-            </w:r>
-          </w:p>
-        </w:tc>
-        <w:tc>
-          <w:tcPr/>
-          <w:p>
-            <w:pPr>
-              <w:pStyle w:val="Compact"/>
-            </w:pPr>
-            <w:r>
-              <w:t xml:space="preserve">(0.3, 0.56)</w:t>
-            </w:r>
-          </w:p>
-        </w:tc>
-      </w:tr>
-      <w:tr>
-        <w:tc>
-          <w:tcPr/>
-          <w:p>
-            <w:pPr>
-              <w:pStyle w:val="Compact"/>
-            </w:pPr>
-          </w:p>
-        </w:tc>
-        <w:tc>
-          <w:tcPr/>
-          <w:p>
-            <w:pPr>
-              <w:pStyle w:val="Compact"/>
-            </w:pPr>
-            <w:r>
-              <w:t xml:space="preserve">6.6</w:t>
-            </w:r>
-          </w:p>
-        </w:tc>
-        <w:tc>
-          <w:tcPr/>
-          <w:p>
-            <w:pPr>
-              <w:pStyle w:val="Compact"/>
-            </w:pPr>
-            <w:r>
-              <w:t xml:space="preserve">6.9</w:t>
-            </w:r>
-          </w:p>
-        </w:tc>
-      </w:tr>
-      <w:tr>
-        <w:tc>
-          <w:tcPr/>
-          <w:p>
-            <w:pPr>
-              <w:pStyle w:val="Compact"/>
-            </w:pPr>
+              <w:t xml:space="preserve">0.44</w:t>
+            </w:r>
+          </w:p>
+        </w:tc>
+      </w:tr>
+      <w:tr>
+        <w:tc>
+          <w:tcPr/>
+          <w:p>
+            <w:pPr>
+              <w:pStyle w:val="Compact"/>
+            </w:pPr>
+          </w:p>
+        </w:tc>
+        <w:tc>
+          <w:tcPr/>
+          <w:p>
+            <w:pPr>
+              <w:pStyle w:val="Compact"/>
+            </w:pPr>
+            <w:r>
+              <w:t xml:space="preserve">(3, 6)</w:t>
+            </w:r>
+          </w:p>
+        </w:tc>
+        <w:tc>
+          <w:tcPr/>
+          <w:p>
+            <w:pPr>
+              <w:pStyle w:val="Compact"/>
+            </w:pPr>
+            <w:r>
+              <w:t xml:space="preserve">(0.3, 0.58)</w:t>
+            </w:r>
+          </w:p>
+        </w:tc>
+      </w:tr>
+      <w:tr>
+        <w:tc>
+          <w:tcPr/>
+          <w:p>
+            <w:pPr>
+              <w:pStyle w:val="Compact"/>
+            </w:pPr>
+          </w:p>
+        </w:tc>
+        <w:tc>
+          <w:tcPr/>
+          <w:p>
+            <w:pPr>
+              <w:pStyle w:val="Compact"/>
+            </w:pPr>
+            <w:r>
+              <w:t xml:space="preserve">6.4</w:t>
+            </w:r>
+          </w:p>
+        </w:tc>
+        <w:tc>
+          <w:tcPr/>
+          <w:p>
+            <w:pPr>
+              <w:pStyle w:val="Compact"/>
+            </w:pPr>
+            <w:r>
+              <w:t xml:space="preserve">6.5</w:t>
+            </w:r>
+          </w:p>
+        </w:tc>
+      </w:tr>
+      <w:tr>
+        <w:tc>
+          <w:tcPr/>
+          <w:p>
+            <w:pPr>
+              <w:pStyle w:val="Compact"/>
+            </w:pPr>
+          </w:p>
+        </w:tc>
+        <w:tc>
+          <w:tcPr/>
+          <w:p>
+            <w:pPr>
+              <w:pStyle w:val="Compact"/>
+            </w:pPr>
+            <w:r>
+              <w:t xml:space="preserve">8e-07</w:t>
+            </w:r>
           </w:p>
         </w:tc>
         <w:tc>
@@ -613,17 +624,6 @@
             </w:r>
           </w:p>
         </w:tc>
-        <w:tc>
-          <w:tcPr/>
-          <w:p>
-            <w:pPr>
-              <w:pStyle w:val="Compact"/>
-            </w:pPr>
-            <w:r>
-              <w:t xml:space="preserve">2e-07</w:t>
-            </w:r>
-          </w:p>
-        </w:tc>
       </w:tr>
       <w:tr>
         <w:tc>
@@ -644,18 +644,18 @@
               <w:pStyle w:val="Compact"/>
             </w:pPr>
             <w:r>
-              <w:t xml:space="preserve">1</w:t>
-            </w:r>
-          </w:p>
-        </w:tc>
-        <w:tc>
-          <w:tcPr/>
-          <w:p>
-            <w:pPr>
-              <w:pStyle w:val="Compact"/>
-            </w:pPr>
-            <w:r>
-              <w:t xml:space="preserve">0.12</w:t>
+              <w:t xml:space="preserve">0.92</w:t>
+            </w:r>
+          </w:p>
+        </w:tc>
+        <w:tc>
+          <w:tcPr/>
+          <w:p>
+            <w:pPr>
+              <w:pStyle w:val="Compact"/>
+            </w:pPr>
+            <w:r>
+              <w:t xml:space="preserve">0.11</w:t>
             </w:r>
           </w:p>
         </w:tc>
@@ -679,18 +679,18 @@
               <w:pStyle w:val="Compact"/>
             </w:pPr>
             <w:r>
-              <w:t xml:space="preserve">1.9</w:t>
-            </w:r>
-          </w:p>
-        </w:tc>
-        <w:tc>
-          <w:tcPr/>
-          <w:p>
-            <w:pPr>
-              <w:pStyle w:val="Compact"/>
-            </w:pPr>
-            <w:r>
-              <w:t xml:space="preserve">0.18</w:t>
+              <w:t xml:space="preserve">2</w:t>
+            </w:r>
+          </w:p>
+        </w:tc>
+        <w:tc>
+          <w:tcPr/>
+          <w:p>
+            <w:pPr>
+              <w:pStyle w:val="Compact"/>
+            </w:pPr>
+            <w:r>
+              <w:t xml:space="preserve">0.19</w:t>
             </w:r>
           </w:p>
         </w:tc>
@@ -867,7 +867,7 @@
               <w:pStyle w:val="Compact"/>
             </w:pPr>
             <w:r>
-              <w:t xml:space="preserve">(8.5, 14)</w:t>
+              <w:t xml:space="preserve">(8.4, 14)</w:t>
             </w:r>
           </w:p>
         </w:tc>
@@ -931,18 +931,18 @@
               <w:pStyle w:val="Compact"/>
             </w:pPr>
             <w:r>
-              <w:t xml:space="preserve">6e-09</w:t>
-            </w:r>
-          </w:p>
-        </w:tc>
-        <w:tc>
-          <w:tcPr/>
-          <w:p>
-            <w:pPr>
-              <w:pStyle w:val="Compact"/>
-            </w:pPr>
-            <w:r>
-              <w:t xml:space="preserve">2e-16</w:t>
+              <w:t xml:space="preserve">5e-09</w:t>
+            </w:r>
+          </w:p>
+        </w:tc>
+        <w:tc>
+          <w:tcPr/>
+          <w:p>
+            <w:pPr>
+              <w:pStyle w:val="Compact"/>
+            </w:pPr>
+            <w:r>
+              <w:t xml:space="preserve">3e-16</w:t>
             </w:r>
           </w:p>
         </w:tc>
@@ -966,7 +966,7 @@
               <w:pStyle w:val="Compact"/>
             </w:pPr>
             <w:r>
-              <w:t xml:space="preserve">-0.085</w:t>
+              <w:t xml:space="preserve">-0.081</w:t>
             </w:r>
           </w:p>
         </w:tc>
@@ -998,50 +998,50 @@
               <w:pStyle w:val="Compact"/>
             </w:pPr>
             <w:r>
-              <w:t xml:space="preserve">(-0.19, 0.024)</w:t>
-            </w:r>
-          </w:p>
-        </w:tc>
-        <w:tc>
-          <w:tcPr/>
-          <w:p>
-            <w:pPr>
-              <w:pStyle w:val="Compact"/>
-            </w:pPr>
-            <w:r>
-              <w:t xml:space="preserve">(-0.017, 0.0037)</w:t>
-            </w:r>
-          </w:p>
-        </w:tc>
-      </w:tr>
-      <w:tr>
-        <w:tc>
-          <w:tcPr/>
-          <w:p>
-            <w:pPr>
-              <w:pStyle w:val="Compact"/>
-            </w:pPr>
-          </w:p>
-        </w:tc>
-        <w:tc>
-          <w:tcPr/>
-          <w:p>
-            <w:pPr>
-              <w:pStyle w:val="Compact"/>
-            </w:pPr>
-            <w:r>
-              <w:t xml:space="preserve">-1.6</w:t>
-            </w:r>
-          </w:p>
-        </w:tc>
-        <w:tc>
-          <w:tcPr/>
-          <w:p>
-            <w:pPr>
-              <w:pStyle w:val="Compact"/>
-            </w:pPr>
-            <w:r>
-              <w:t xml:space="preserve">-1.3</w:t>
+              <w:t xml:space="preserve">(-0.19, 0.031)</w:t>
+            </w:r>
+          </w:p>
+        </w:tc>
+        <w:tc>
+          <w:tcPr/>
+          <w:p>
+            <w:pPr>
+              <w:pStyle w:val="Compact"/>
+            </w:pPr>
+            <w:r>
+              <w:t xml:space="preserve">(-0.018, 0.0044)</w:t>
+            </w:r>
+          </w:p>
+        </w:tc>
+      </w:tr>
+      <w:tr>
+        <w:tc>
+          <w:tcPr/>
+          <w:p>
+            <w:pPr>
+              <w:pStyle w:val="Compact"/>
+            </w:pPr>
+          </w:p>
+        </w:tc>
+        <w:tc>
+          <w:tcPr/>
+          <w:p>
+            <w:pPr>
+              <w:pStyle w:val="Compact"/>
+            </w:pPr>
+            <w:r>
+              <w:t xml:space="preserve">-1.5</w:t>
+            </w:r>
+          </w:p>
+        </w:tc>
+        <w:tc>
+          <w:tcPr/>
+          <w:p>
+            <w:pPr>
+              <w:pStyle w:val="Compact"/>
+            </w:pPr>
+            <w:r>
+              <w:t xml:space="preserve">-1.2</w:t>
             </w:r>
           </w:p>
         </w:tc>
@@ -1129,72 +1129,61 @@
               <w:pStyle w:val="Compact"/>
             </w:pPr>
             <w:r>
-              <w:t xml:space="preserve">(0.13, 0.38)</w:t>
-            </w:r>
-          </w:p>
-        </w:tc>
-        <w:tc>
-          <w:tcPr/>
-          <w:p>
-            <w:pPr>
-              <w:pStyle w:val="Compact"/>
-            </w:pPr>
-            <w:r>
-              <w:t xml:space="preserve">(0.012, 0.035)</w:t>
-            </w:r>
-          </w:p>
-        </w:tc>
-      </w:tr>
-      <w:tr>
-        <w:tc>
-          <w:tcPr/>
-          <w:p>
-            <w:pPr>
-              <w:pStyle w:val="Compact"/>
-            </w:pPr>
-          </w:p>
-        </w:tc>
-        <w:tc>
-          <w:tcPr/>
-          <w:p>
-            <w:pPr>
-              <w:pStyle w:val="Compact"/>
-            </w:pPr>
-            <w:r>
-              <w:t xml:space="preserve">4.2</w:t>
-            </w:r>
-          </w:p>
-        </w:tc>
-        <w:tc>
-          <w:tcPr/>
-          <w:p>
-            <w:pPr>
-              <w:pStyle w:val="Compact"/>
-            </w:pPr>
-            <w:r>
-              <w:t xml:space="preserve">4.1</w:t>
-            </w:r>
-          </w:p>
-        </w:tc>
-      </w:tr>
-      <w:tr>
-        <w:tc>
-          <w:tcPr/>
-          <w:p>
-            <w:pPr>
-              <w:pStyle w:val="Compact"/>
-            </w:pPr>
-          </w:p>
-        </w:tc>
-        <w:tc>
-          <w:tcPr/>
-          <w:p>
-            <w:pPr>
-              <w:pStyle w:val="Compact"/>
-            </w:pPr>
-            <w:r>
-              <w:t xml:space="preserve">3e-04</w:t>
-            </w:r>
+              <w:t xml:space="preserve">(0.12, 0.38)</w:t>
+            </w:r>
+          </w:p>
+        </w:tc>
+        <w:tc>
+          <w:tcPr/>
+          <w:p>
+            <w:pPr>
+              <w:pStyle w:val="Compact"/>
+            </w:pPr>
+            <w:r>
+              <w:t xml:space="preserve">(0.011, 0.036)</w:t>
+            </w:r>
+          </w:p>
+        </w:tc>
+      </w:tr>
+      <w:tr>
+        <w:tc>
+          <w:tcPr/>
+          <w:p>
+            <w:pPr>
+              <w:pStyle w:val="Compact"/>
+            </w:pPr>
+          </w:p>
+        </w:tc>
+        <w:tc>
+          <w:tcPr/>
+          <w:p>
+            <w:pPr>
+              <w:pStyle w:val="Compact"/>
+            </w:pPr>
+            <w:r>
+              <w:t xml:space="preserve">4</w:t>
+            </w:r>
+          </w:p>
+        </w:tc>
+        <w:tc>
+          <w:tcPr/>
+          <w:p>
+            <w:pPr>
+              <w:pStyle w:val="Compact"/>
+            </w:pPr>
+            <w:r>
+              <w:t xml:space="preserve">3.8</w:t>
+            </w:r>
+          </w:p>
+        </w:tc>
+      </w:tr>
+      <w:tr>
+        <w:tc>
+          <w:tcPr/>
+          <w:p>
+            <w:pPr>
+              <w:pStyle w:val="Compact"/>
+            </w:pPr>
           </w:p>
         </w:tc>
         <w:tc>
@@ -1208,6 +1197,17 @@
             </w:r>
           </w:p>
         </w:tc>
+        <w:tc>
+          <w:tcPr/>
+          <w:p>
+            <w:pPr>
+              <w:pStyle w:val="Compact"/>
+            </w:pPr>
+            <w:r>
+              <w:t xml:space="preserve">8e-04</w:t>
+            </w:r>
+          </w:p>
+        </w:tc>
       </w:tr>
       <w:tr>
         <w:tc>
@@ -1228,18 +1228,18 @@
               <w:pStyle w:val="Compact"/>
             </w:pPr>
             <w:r>
-              <w:t xml:space="preserve">2</w:t>
-            </w:r>
-          </w:p>
-        </w:tc>
-        <w:tc>
-          <w:tcPr/>
-          <w:p>
-            <w:pPr>
-              <w:pStyle w:val="Compact"/>
-            </w:pPr>
-            <w:r>
-              <w:t xml:space="preserve">0.19</w:t>
+              <w:t xml:space="preserve">1.9</w:t>
+            </w:r>
+          </w:p>
+        </w:tc>
+        <w:tc>
+          <w:tcPr/>
+          <w:p>
+            <w:pPr>
+              <w:pStyle w:val="Compact"/>
+            </w:pPr>
+            <w:r>
+              <w:t xml:space="preserve">0.18</w:t>
             </w:r>
           </w:p>
         </w:tc>
@@ -1274,7 +1274,7 @@
               <w:pStyle w:val="Compact"/>
             </w:pPr>
             <w:r>
-              <w:t xml:space="preserve">0.23</w:t>
+              <w:t xml:space="preserve">0.24</w:t>
             </w:r>
           </w:p>
         </w:tc>
@@ -1425,7 +1425,7 @@
               <w:pStyle w:val="Compact"/>
             </w:pPr>
             <w:r>
-              <w:t xml:space="preserve">(8.4, 14)</w:t>
+              <w:t xml:space="preserve">(8.3, 14)</w:t>
             </w:r>
           </w:p>
         </w:tc>
@@ -1457,7 +1457,7 @@
               <w:pStyle w:val="Compact"/>
             </w:pPr>
             <w:r>
-              <w:t xml:space="preserve">8.6</w:t>
+              <w:t xml:space="preserve">8.7</w:t>
             </w:r>
           </w:p>
         </w:tc>
@@ -1489,18 +1489,18 @@
               <w:pStyle w:val="Compact"/>
             </w:pPr>
             <w:r>
-              <w:t xml:space="preserve">4e-09</w:t>
-            </w:r>
-          </w:p>
-        </w:tc>
-        <w:tc>
-          <w:tcPr/>
-          <w:p>
-            <w:pPr>
-              <w:pStyle w:val="Compact"/>
-            </w:pPr>
-            <w:r>
-              <w:t xml:space="preserve">9e-17</w:t>
+              <w:t xml:space="preserve">3e-09</w:t>
+            </w:r>
+          </w:p>
+        </w:tc>
+        <w:tc>
+          <w:tcPr/>
+          <w:p>
+            <w:pPr>
+              <w:pStyle w:val="Compact"/>
+            </w:pPr>
+            <w:r>
+              <w:t xml:space="preserve">1e-16</w:t>
             </w:r>
           </w:p>
         </w:tc>
@@ -1524,82 +1524,82 @@
               <w:pStyle w:val="Compact"/>
             </w:pPr>
             <w:r>
-              <w:t xml:space="preserve">-0.043</w:t>
-            </w:r>
-          </w:p>
-        </w:tc>
-        <w:tc>
-          <w:tcPr/>
-          <w:p>
-            <w:pPr>
-              <w:pStyle w:val="Compact"/>
-            </w:pPr>
-            <w:r>
-              <w:t xml:space="preserve">-0.0034</w:t>
-            </w:r>
-          </w:p>
-        </w:tc>
-      </w:tr>
-      <w:tr>
-        <w:tc>
-          <w:tcPr/>
-          <w:p>
-            <w:pPr>
-              <w:pStyle w:val="Compact"/>
-            </w:pPr>
-          </w:p>
-        </w:tc>
-        <w:tc>
-          <w:tcPr/>
-          <w:p>
-            <w:pPr>
-              <w:pStyle w:val="Compact"/>
-            </w:pPr>
-            <w:r>
-              <w:t xml:space="preserve">(-0.096, 0.0093)</w:t>
-            </w:r>
-          </w:p>
-        </w:tc>
-        <w:tc>
-          <w:tcPr/>
-          <w:p>
-            <w:pPr>
-              <w:pStyle w:val="Compact"/>
-            </w:pPr>
-            <w:r>
-              <w:t xml:space="preserve">(-0.0084, 0.0017)</w:t>
-            </w:r>
-          </w:p>
-        </w:tc>
-      </w:tr>
-      <w:tr>
-        <w:tc>
-          <w:tcPr/>
-          <w:p>
-            <w:pPr>
-              <w:pStyle w:val="Compact"/>
-            </w:pPr>
-          </w:p>
-        </w:tc>
-        <w:tc>
-          <w:tcPr/>
-          <w:p>
-            <w:pPr>
-              <w:pStyle w:val="Compact"/>
-            </w:pPr>
-            <w:r>
-              <w:t xml:space="preserve">-1.7</w:t>
-            </w:r>
-          </w:p>
-        </w:tc>
-        <w:tc>
-          <w:tcPr/>
-          <w:p>
-            <w:pPr>
-              <w:pStyle w:val="Compact"/>
-            </w:pPr>
-            <w:r>
-              <w:t xml:space="preserve">-1.4</w:t>
+              <w:t xml:space="preserve">-0.042</w:t>
+            </w:r>
+          </w:p>
+        </w:tc>
+        <w:tc>
+          <w:tcPr/>
+          <w:p>
+            <w:pPr>
+              <w:pStyle w:val="Compact"/>
+            </w:pPr>
+            <w:r>
+              <w:t xml:space="preserve">-0.0033</w:t>
+            </w:r>
+          </w:p>
+        </w:tc>
+      </w:tr>
+      <w:tr>
+        <w:tc>
+          <w:tcPr/>
+          <w:p>
+            <w:pPr>
+              <w:pStyle w:val="Compact"/>
+            </w:pPr>
+          </w:p>
+        </w:tc>
+        <w:tc>
+          <w:tcPr/>
+          <w:p>
+            <w:pPr>
+              <w:pStyle w:val="Compact"/>
+            </w:pPr>
+            <w:r>
+              <w:t xml:space="preserve">(-0.096, 0.012)</w:t>
+            </w:r>
+          </w:p>
+        </w:tc>
+        <w:tc>
+          <w:tcPr/>
+          <w:p>
+            <w:pPr>
+              <w:pStyle w:val="Compact"/>
+            </w:pPr>
+            <w:r>
+              <w:t xml:space="preserve">(-0.0087, 0.0021)</w:t>
+            </w:r>
+          </w:p>
+        </w:tc>
+      </w:tr>
+      <w:tr>
+        <w:tc>
+          <w:tcPr/>
+          <w:p>
+            <w:pPr>
+              <w:pStyle w:val="Compact"/>
+            </w:pPr>
+          </w:p>
+        </w:tc>
+        <w:tc>
+          <w:tcPr/>
+          <w:p>
+            <w:pPr>
+              <w:pStyle w:val="Compact"/>
+            </w:pPr>
+            <w:r>
+              <w:t xml:space="preserve">-1.6</w:t>
+            </w:r>
+          </w:p>
+        </w:tc>
+        <w:tc>
+          <w:tcPr/>
+          <w:p>
+            <w:pPr>
+              <w:pStyle w:val="Compact"/>
+            </w:pPr>
+            <w:r>
+              <w:t xml:space="preserve">-1.3</w:t>
             </w:r>
           </w:p>
         </w:tc>
@@ -1655,7 +1655,7 @@
               <w:pStyle w:val="Compact"/>
             </w:pPr>
             <w:r>
-              <w:t xml:space="preserve">0.14</w:t>
+              <w:t xml:space="preserve">0.13</w:t>
             </w:r>
           </w:p>
         </w:tc>
@@ -1687,82 +1687,82 @@
               <w:pStyle w:val="Compact"/>
             </w:pPr>
             <w:r>
-              <w:t xml:space="preserve">(0.071, 0.2)</w:t>
-            </w:r>
-          </w:p>
-        </w:tc>
-        <w:tc>
-          <w:tcPr/>
-          <w:p>
-            <w:pPr>
-              <w:pStyle w:val="Compact"/>
-            </w:pPr>
-            <w:r>
-              <w:t xml:space="preserve">(0.0065, 0.019)</w:t>
-            </w:r>
-          </w:p>
-        </w:tc>
-      </w:tr>
-      <w:tr>
-        <w:tc>
-          <w:tcPr/>
-          <w:p>
-            <w:pPr>
-              <w:pStyle w:val="Compact"/>
-            </w:pPr>
-          </w:p>
-        </w:tc>
-        <w:tc>
-          <w:tcPr/>
-          <w:p>
-            <w:pPr>
-              <w:pStyle w:val="Compact"/>
-            </w:pPr>
-            <w:r>
-              <w:t xml:space="preserve">4.3</w:t>
-            </w:r>
-          </w:p>
-        </w:tc>
-        <w:tc>
-          <w:tcPr/>
-          <w:p>
-            <w:pPr>
-              <w:pStyle w:val="Compact"/>
-            </w:pPr>
-            <w:r>
-              <w:t xml:space="preserve">4.2</w:t>
-            </w:r>
-          </w:p>
-        </w:tc>
-      </w:tr>
-      <w:tr>
-        <w:tc>
-          <w:tcPr/>
-          <w:p>
-            <w:pPr>
-              <w:pStyle w:val="Compact"/>
-            </w:pPr>
-          </w:p>
-        </w:tc>
-        <w:tc>
-          <w:tcPr/>
-          <w:p>
-            <w:pPr>
-              <w:pStyle w:val="Compact"/>
-            </w:pPr>
-            <w:r>
-              <w:t xml:space="preserve">2e-04</w:t>
-            </w:r>
-          </w:p>
-        </w:tc>
-        <w:tc>
-          <w:tcPr/>
-          <w:p>
-            <w:pPr>
-              <w:pStyle w:val="Compact"/>
-            </w:pPr>
-            <w:r>
-              <w:t xml:space="preserve">3e-04</w:t>
+              <w:t xml:space="preserve">(0.067, 0.2)</w:t>
+            </w:r>
+          </w:p>
+        </w:tc>
+        <w:tc>
+          <w:tcPr/>
+          <w:p>
+            <w:pPr>
+              <w:pStyle w:val="Compact"/>
+            </w:pPr>
+            <w:r>
+              <w:t xml:space="preserve">(0.0061, 0.02)</w:t>
+            </w:r>
+          </w:p>
+        </w:tc>
+      </w:tr>
+      <w:tr>
+        <w:tc>
+          <w:tcPr/>
+          <w:p>
+            <w:pPr>
+              <w:pStyle w:val="Compact"/>
+            </w:pPr>
+          </w:p>
+        </w:tc>
+        <w:tc>
+          <w:tcPr/>
+          <w:p>
+            <w:pPr>
+              <w:pStyle w:val="Compact"/>
+            </w:pPr>
+            <w:r>
+              <w:t xml:space="preserve">4.1</w:t>
+            </w:r>
+          </w:p>
+        </w:tc>
+        <w:tc>
+          <w:tcPr/>
+          <w:p>
+            <w:pPr>
+              <w:pStyle w:val="Compact"/>
+            </w:pPr>
+            <w:r>
+              <w:t xml:space="preserve">3.9</w:t>
+            </w:r>
+          </w:p>
+        </w:tc>
+      </w:tr>
+      <w:tr>
+        <w:tc>
+          <w:tcPr/>
+          <w:p>
+            <w:pPr>
+              <w:pStyle w:val="Compact"/>
+            </w:pPr>
+          </w:p>
+        </w:tc>
+        <w:tc>
+          <w:tcPr/>
+          <w:p>
+            <w:pPr>
+              <w:pStyle w:val="Compact"/>
+            </w:pPr>
+            <w:r>
+              <w:t xml:space="preserve">4e-04</w:t>
+            </w:r>
+          </w:p>
+        </w:tc>
+        <w:tc>
+          <w:tcPr/>
+          <w:p>
+            <w:pPr>
+              <w:pStyle w:val="Compact"/>
+            </w:pPr>
+            <w:r>
+              <w:t xml:space="preserve">6e-04</w:t>
             </w:r>
           </w:p>
         </w:tc>
@@ -1786,18 +1786,18 @@
               <w:pStyle w:val="Compact"/>
             </w:pPr>
             <w:r>
-              <w:t xml:space="preserve">1.9</w:t>
-            </w:r>
-          </w:p>
-        </w:tc>
-        <w:tc>
-          <w:tcPr/>
-          <w:p>
-            <w:pPr>
-              <w:pStyle w:val="Compact"/>
-            </w:pPr>
-            <w:r>
-              <w:t xml:space="preserve">0.18</w:t>
+              <w:t xml:space="preserve">1.8</w:t>
+            </w:r>
+          </w:p>
+        </w:tc>
+        <w:tc>
+          <w:tcPr/>
+          <w:p>
+            <w:pPr>
+              <w:pStyle w:val="Compact"/>
+            </w:pPr>
+            <w:r>
+              <w:t xml:space="preserve">0.17</w:t>
             </w:r>
           </w:p>
         </w:tc>
@@ -1821,18 +1821,18 @@
               <w:pStyle w:val="Compact"/>
             </w:pPr>
             <w:r>
-              <w:t xml:space="preserve">2.3</w:t>
-            </w:r>
-          </w:p>
-        </w:tc>
-        <w:tc>
-          <w:tcPr/>
-          <w:p>
-            <w:pPr>
-              <w:pStyle w:val="Compact"/>
-            </w:pPr>
-            <w:r>
-              <w:t xml:space="preserve">0.22</w:t>
+              <w:t xml:space="preserve">2.4</w:t>
+            </w:r>
+          </w:p>
+        </w:tc>
+        <w:tc>
+          <w:tcPr/>
+          <w:p>
+            <w:pPr>
+              <w:pStyle w:val="Compact"/>
+            </w:pPr>
+            <w:r>
+              <w:t xml:space="preserve">0.24</w:t>
             </w:r>
           </w:p>
         </w:tc>
@@ -2001,7 +2001,7 @@
               <w:pStyle w:val="Compact"/>
             </w:pPr>
             <w:r>
-              <w:t xml:space="preserve">(9.6, 13)</w:t>
+              <w:t xml:space="preserve">(9.7, 13)</w:t>
             </w:r>
           </w:p>
         </w:tc>
@@ -2033,50 +2033,50 @@
               <w:pStyle w:val="Compact"/>
             </w:pPr>
             <w:r>
-              <w:t xml:space="preserve">13</w:t>
-            </w:r>
-          </w:p>
-        </w:tc>
-        <w:tc>
-          <w:tcPr/>
-          <w:p>
-            <w:pPr>
-              <w:pStyle w:val="Compact"/>
-            </w:pPr>
-            <w:r>
-              <w:t xml:space="preserve">28</w:t>
-            </w:r>
-          </w:p>
-        </w:tc>
-      </w:tr>
-      <w:tr>
-        <w:tc>
-          <w:tcPr/>
-          <w:p>
-            <w:pPr>
-              <w:pStyle w:val="Compact"/>
-            </w:pPr>
-          </w:p>
-        </w:tc>
-        <w:tc>
-          <w:tcPr/>
-          <w:p>
-            <w:pPr>
-              <w:pStyle w:val="Compact"/>
-            </w:pPr>
-            <w:r>
-              <w:t xml:space="preserve">6e-13</w:t>
-            </w:r>
-          </w:p>
-        </w:tc>
-        <w:tc>
-          <w:tcPr/>
-          <w:p>
-            <w:pPr>
-              <w:pStyle w:val="Compact"/>
-            </w:pPr>
-            <w:r>
-              <w:t xml:space="preserve">1e-21</w:t>
+              <w:t xml:space="preserve">14</w:t>
+            </w:r>
+          </w:p>
+        </w:tc>
+        <w:tc>
+          <w:tcPr/>
+          <w:p>
+            <w:pPr>
+              <w:pStyle w:val="Compact"/>
+            </w:pPr>
+            <w:r>
+              <w:t xml:space="preserve">30</w:t>
+            </w:r>
+          </w:p>
+        </w:tc>
+      </w:tr>
+      <w:tr>
+        <w:tc>
+          <w:tcPr/>
+          <w:p>
+            <w:pPr>
+              <w:pStyle w:val="Compact"/>
+            </w:pPr>
+          </w:p>
+        </w:tc>
+        <w:tc>
+          <w:tcPr/>
+          <w:p>
+            <w:pPr>
+              <w:pStyle w:val="Compact"/>
+            </w:pPr>
+            <w:r>
+              <w:t xml:space="preserve">1e-13</w:t>
+            </w:r>
+          </w:p>
+        </w:tc>
+        <w:tc>
+          <w:tcPr/>
+          <w:p>
+            <w:pPr>
+              <w:pStyle w:val="Compact"/>
+            </w:pPr>
+            <w:r>
+              <w:t xml:space="preserve">3e-22</w:t>
             </w:r>
           </w:p>
         </w:tc>
@@ -2100,50 +2100,50 @@
               <w:pStyle w:val="Compact"/>
             </w:pPr>
             <w:r>
-              <w:t xml:space="preserve">-0.28</w:t>
-            </w:r>
-          </w:p>
-        </w:tc>
-        <w:tc>
-          <w:tcPr/>
-          <w:p>
-            <w:pPr>
-              <w:pStyle w:val="Compact"/>
-            </w:pPr>
-            <w:r>
-              <w:t xml:space="preserve">-0.027</w:t>
-            </w:r>
-          </w:p>
-        </w:tc>
-      </w:tr>
-      <w:tr>
-        <w:tc>
-          <w:tcPr/>
-          <w:p>
-            <w:pPr>
-              <w:pStyle w:val="Compact"/>
-            </w:pPr>
-          </w:p>
-        </w:tc>
-        <w:tc>
-          <w:tcPr/>
-          <w:p>
-            <w:pPr>
-              <w:pStyle w:val="Compact"/>
-            </w:pPr>
-            <w:r>
-              <w:t xml:space="preserve">(-0.51, -0.047)</w:t>
-            </w:r>
-          </w:p>
-        </w:tc>
-        <w:tc>
-          <w:tcPr/>
-          <w:p>
-            <w:pPr>
-              <w:pStyle w:val="Compact"/>
-            </w:pPr>
-            <w:r>
-              <w:t xml:space="preserve">(-0.049, -0.0052)</w:t>
+              <w:t xml:space="preserve">-0.29</w:t>
+            </w:r>
+          </w:p>
+        </w:tc>
+        <w:tc>
+          <w:tcPr/>
+          <w:p>
+            <w:pPr>
+              <w:pStyle w:val="Compact"/>
+            </w:pPr>
+            <w:r>
+              <w:t xml:space="preserve">-0.029</w:t>
+            </w:r>
+          </w:p>
+        </w:tc>
+      </w:tr>
+      <w:tr>
+        <w:tc>
+          <w:tcPr/>
+          <w:p>
+            <w:pPr>
+              <w:pStyle w:val="Compact"/>
+            </w:pPr>
+          </w:p>
+        </w:tc>
+        <w:tc>
+          <w:tcPr/>
+          <w:p>
+            <w:pPr>
+              <w:pStyle w:val="Compact"/>
+            </w:pPr>
+            <w:r>
+              <w:t xml:space="preserve">(-0.53, -0.057)</w:t>
+            </w:r>
+          </w:p>
+        </w:tc>
+        <w:tc>
+          <w:tcPr/>
+          <w:p>
+            <w:pPr>
+              <w:pStyle w:val="Compact"/>
+            </w:pPr>
+            <w:r>
+              <w:t xml:space="preserve">(-0.053, -0.0058)</w:t>
             </w:r>
           </w:p>
         </w:tc>
@@ -2175,7 +2175,7 @@
               <w:pStyle w:val="Compact"/>
             </w:pPr>
             <w:r>
-              <w:t xml:space="preserve">-2.5</w:t>
+              <w:t xml:space="preserve">-2.6</w:t>
             </w:r>
           </w:p>
         </w:tc>
@@ -2242,39 +2242,39 @@
               <w:pStyle w:val="Compact"/>
             </w:pPr>
             <w:r>
-              <w:t xml:space="preserve">0.048</w:t>
-            </w:r>
-          </w:p>
-        </w:tc>
-      </w:tr>
-      <w:tr>
-        <w:tc>
-          <w:tcPr/>
-          <w:p>
-            <w:pPr>
-              <w:pStyle w:val="Compact"/>
-            </w:pPr>
-          </w:p>
-        </w:tc>
-        <w:tc>
-          <w:tcPr/>
-          <w:p>
-            <w:pPr>
-              <w:pStyle w:val="Compact"/>
-            </w:pPr>
-            <w:r>
-              <w:t xml:space="preserve">(0.25, 0.79)</w:t>
-            </w:r>
-          </w:p>
-        </w:tc>
-        <w:tc>
-          <w:tcPr/>
-          <w:p>
-            <w:pPr>
-              <w:pStyle w:val="Compact"/>
-            </w:pPr>
-            <w:r>
-              <w:t xml:space="preserve">(0.022, 0.074)</w:t>
+              <w:t xml:space="preserve">0.049</w:t>
+            </w:r>
+          </w:p>
+        </w:tc>
+      </w:tr>
+      <w:tr>
+        <w:tc>
+          <w:tcPr/>
+          <w:p>
+            <w:pPr>
+              <w:pStyle w:val="Compact"/>
+            </w:pPr>
+          </w:p>
+        </w:tc>
+        <w:tc>
+          <w:tcPr/>
+          <w:p>
+            <w:pPr>
+              <w:pStyle w:val="Compact"/>
+            </w:pPr>
+            <w:r>
+              <w:t xml:space="preserve">(0.24, 0.8)</w:t>
+            </w:r>
+          </w:p>
+        </w:tc>
+        <w:tc>
+          <w:tcPr/>
+          <w:p>
+            <w:pPr>
+              <w:pStyle w:val="Compact"/>
+            </w:pPr>
+            <w:r>
+              <w:t xml:space="preserve">(0.021, 0.076)</w:t>
             </w:r>
           </w:p>
         </w:tc>
@@ -2306,39 +2306,39 @@
               <w:pStyle w:val="Compact"/>
             </w:pPr>
             <w:r>
-              <w:t xml:space="preserve">3.8</w:t>
-            </w:r>
-          </w:p>
-        </w:tc>
-      </w:tr>
-      <w:tr>
-        <w:tc>
-          <w:tcPr/>
-          <w:p>
-            <w:pPr>
-              <w:pStyle w:val="Compact"/>
-            </w:pPr>
-          </w:p>
-        </w:tc>
-        <w:tc>
-          <w:tcPr/>
-          <w:p>
-            <w:pPr>
-              <w:pStyle w:val="Compact"/>
-            </w:pPr>
-            <w:r>
-              <w:t xml:space="preserve">5e-04</w:t>
-            </w:r>
-          </w:p>
-        </w:tc>
-        <w:tc>
-          <w:tcPr/>
-          <w:p>
-            <w:pPr>
-              <w:pStyle w:val="Compact"/>
-            </w:pPr>
-            <w:r>
-              <w:t xml:space="preserve">7e-04</w:t>
+              <w:t xml:space="preserve">3.6</w:t>
+            </w:r>
+          </w:p>
+        </w:tc>
+      </w:tr>
+      <w:tr>
+        <w:tc>
+          <w:tcPr/>
+          <w:p>
+            <w:pPr>
+              <w:pStyle w:val="Compact"/>
+            </w:pPr>
+          </w:p>
+        </w:tc>
+        <w:tc>
+          <w:tcPr/>
+          <w:p>
+            <w:pPr>
+              <w:pStyle w:val="Compact"/>
+            </w:pPr>
+            <w:r>
+              <w:t xml:space="preserve">6e-04</w:t>
+            </w:r>
+          </w:p>
+        </w:tc>
+        <w:tc>
+          <w:tcPr/>
+          <w:p>
+            <w:pPr>
+              <w:pStyle w:val="Compact"/>
+            </w:pPr>
+            <w:r>
+              <w:t xml:space="preserve">0.001</w:t>
             </w:r>
           </w:p>
         </w:tc>
@@ -2362,18 +2362,18 @@
               <w:pStyle w:val="Compact"/>
             </w:pPr>
             <w:r>
-              <w:t xml:space="preserve">1.3</w:t>
-            </w:r>
-          </w:p>
-        </w:tc>
-        <w:tc>
-          <w:tcPr/>
-          <w:p>
-            <w:pPr>
-              <w:pStyle w:val="Compact"/>
-            </w:pPr>
-            <w:r>
-              <w:t xml:space="preserve">0.11</w:t>
+              <w:t xml:space="preserve">1.2</w:t>
+            </w:r>
+          </w:p>
+        </w:tc>
+        <w:tc>
+          <w:tcPr/>
+          <w:p>
+            <w:pPr>
+              <w:pStyle w:val="Compact"/>
+            </w:pPr>
+            <w:r>
+              <w:t xml:space="preserve">0.096</w:t>
             </w:r>
           </w:p>
         </w:tc>
@@ -2397,18 +2397,18 @@
               <w:pStyle w:val="Compact"/>
             </w:pPr>
             <w:r>
-              <w:t xml:space="preserve">2.5</w:t>
-            </w:r>
-          </w:p>
-        </w:tc>
-        <w:tc>
-          <w:tcPr/>
-          <w:p>
-            <w:pPr>
-              <w:pStyle w:val="Compact"/>
-            </w:pPr>
-            <w:r>
-              <w:t xml:space="preserve">0.24</w:t>
+              <w:t xml:space="preserve">2.6</w:t>
+            </w:r>
+          </w:p>
+        </w:tc>
+        <w:tc>
+          <w:tcPr/>
+          <w:p>
+            <w:pPr>
+              <w:pStyle w:val="Compact"/>
+            </w:pPr>
+            <w:r>
+              <w:t xml:space="preserve">0.26</w:t>
             </w:r>
           </w:p>
         </w:tc>
@@ -2463,6 +2463,63 @@
     </w:p>
     <w:bookmarkEnd w:id="26"/>
     <w:bookmarkEnd w:id="27"/>
+    <w:bookmarkStart w:id="31" w:name="ordination"/>
+    <w:p>
+      <w:pPr>
+        <w:pStyle w:val="Heading1"/>
+      </w:pPr>
+      <w:r>
+        <w:t xml:space="preserve">Ordination</w:t>
+      </w:r>
+    </w:p>
+    <w:p>
+      <w:pPr>
+        <w:pStyle w:val="FirstParagraph"/>
+      </w:pPr>
+      <w:r>
+        <w:drawing>
+          <wp:inline>
+            <wp:extent cx="5334000" cy="2667000"/>
+            <wp:effectExtent b="0" l="0" r="0" t="0"/>
+            <wp:docPr descr="" title="" id="29" name="Picture"/>
+            <a:graphic>
+              <a:graphicData uri="http://schemas.openxmlformats.org/drawingml/2006/picture">
+                <pic:pic>
+                  <pic:nvPicPr>
+                    <pic:cNvPr descr="../graphics/ordination.png" id="30" name="Picture"/>
+                    <pic:cNvPicPr>
+                      <a:picLocks noChangeArrowheads="1" noChangeAspect="1"/>
+                    </pic:cNvPicPr>
+                  </pic:nvPicPr>
+                  <pic:blipFill>
+                    <a:blip r:embed="rId28"/>
+                    <a:stretch>
+                      <a:fillRect/>
+                    </a:stretch>
+                  </pic:blipFill>
+                  <pic:spPr bwMode="auto">
+                    <a:xfrm>
+                      <a:off x="0" y="0"/>
+                      <a:ext cx="5334000" cy="2667000"/>
+                    </a:xfrm>
+                    <a:prstGeom prst="rect">
+                      <a:avLst/>
+                    </a:prstGeom>
+                    <a:noFill/>
+                    <a:ln w="9525">
+                      <a:noFill/>
+                      <a:headEnd/>
+                      <a:tailEnd/>
+                    </a:ln>
+                  </pic:spPr>
+                </pic:pic>
+              </a:graphicData>
+            </a:graphic>
+          </wp:inline>
+        </w:drawing>
+      </w:r>
+    </w:p>
+    <w:bookmarkEnd w:id="31"/>
     <w:sectPr>
       <w:footnotePr>
         <w:numRestart w:val="eachSect"/>

</xml_diff>